<commit_message>
Update preprocessing plan with mHealth and storage estimates
</commit_message>
<xml_diff>
--- a/Preprocessing_plan.docx
+++ b/Preprocessing_plan.docx
@@ -392,23 +392,7 @@
           <w:rFonts w:ascii="Arial" w:hAnsi="Arial" w:cs="Arial"/>
           <w:color w:val="000000" w:themeColor="text1"/>
         </w:rPr>
-        <w:t xml:space="preserve"> from 100 Hz to 20 Hz using a 4th-order Butterworth low-pass filter with a 10 Hz cutoff (the Nyquist frequency for 20 Hz) applied before decimation by factor 5 (Nagima </w:t>
-      </w:r>
-      <w:proofErr w:type="spellStart"/>
-      <w:r>
-        <w:rPr>
-          <w:rFonts w:ascii="Arial" w:hAnsi="Arial" w:cs="Arial"/>
-          <w:color w:val="000000" w:themeColor="text1"/>
-        </w:rPr>
-        <w:t>Abdrasulova</w:t>
-      </w:r>
-      <w:proofErr w:type="spellEnd"/>
-      <w:r>
-        <w:rPr>
-          <w:rFonts w:ascii="Arial" w:hAnsi="Arial" w:cs="Arial"/>
-          <w:color w:val="000000" w:themeColor="text1"/>
-        </w:rPr>
-        <w:t xml:space="preserve"> et al., 2025) to prevent aliasing. </w:t>
+        <w:t xml:space="preserve"> from 100 Hz to 20 Hz using a 4th-order Butterworth low-pass filter with a 10 Hz cutoff (the Nyquist frequency for 20 Hz) applied (Nagima Abdrasulova et al., 2025) to prevent aliasing. </w:t>
       </w:r>
       <w:proofErr w:type="spellStart"/>
       <w:r>
@@ -551,21 +535,21 @@
     </w:p>
     <w:p>
       <w:pPr>
-        <w:spacing w:before="160" w:after="80"/>
-        <w:jc w:val="both"/>
-        <w:rPr>
-          <w:rFonts w:ascii="Arial" w:hAnsi="Arial" w:cs="Arial"/>
-          <w:color w:val="000000" w:themeColor="text1"/>
-        </w:rPr>
-      </w:pPr>
-      <w:r>
-        <w:rPr>
-          <w:rFonts w:ascii="Arial" w:eastAsia="Arial" w:hAnsi="Arial" w:cs="Arial"/>
+        <w:spacing w:before="40" w:after="40"/>
+        <w:jc w:val="both"/>
+        <w:rPr>
+          <w:rFonts w:ascii="Arial" w:hAnsi="Arial" w:cs="Arial"/>
+          <w:color w:val="000000" w:themeColor="text1"/>
+        </w:rPr>
+      </w:pPr>
+      <w:r>
+        <w:rPr>
+          <w:rFonts w:ascii="Arial" w:hAnsi="Arial" w:cs="Arial"/>
           <w:b/>
           <w:bCs/>
           <w:color w:val="000000" w:themeColor="text1"/>
         </w:rPr>
-        <w:t>3. EEG: EEGMMIDB</w:t>
+        <w:t>2b. mHealth (Bonus HAR Dataset)</w:t>
       </w:r>
     </w:p>
     <w:p>
@@ -579,166 +563,180 @@
       </w:pPr>
       <w:r>
         <w:rPr>
-          <w:rFonts w:ascii="Arial" w:eastAsia="Arial" w:hAnsi="Arial" w:cs="Arial"/>
-          <w:color w:val="000000" w:themeColor="text1"/>
-        </w:rPr>
-        <w:t>Only runs 4, 8, and 12 are used</w:t>
-      </w:r>
-      <w:r>
-        <w:rPr>
-          <w:rFonts w:ascii="Arial" w:eastAsia="Arial" w:hAnsi="Arial" w:cs="Arial"/>
-          <w:color w:val="000000" w:themeColor="text1"/>
-        </w:rPr>
-        <w:t>. T</w:t>
-      </w:r>
-      <w:r>
-        <w:rPr>
-          <w:rFonts w:ascii="Arial" w:eastAsia="Arial" w:hAnsi="Arial" w:cs="Arial"/>
-          <w:color w:val="000000" w:themeColor="text1"/>
-        </w:rPr>
-        <w:t>he motor imagery runs provid</w:t>
-      </w:r>
-      <w:r>
-        <w:rPr>
-          <w:rFonts w:ascii="Arial" w:eastAsia="Arial" w:hAnsi="Arial" w:cs="Arial"/>
-          <w:color w:val="000000" w:themeColor="text1"/>
-        </w:rPr>
-        <w:t>e</w:t>
-      </w:r>
-      <w:r>
-        <w:rPr>
-          <w:rFonts w:ascii="Arial" w:eastAsia="Arial" w:hAnsi="Arial" w:cs="Arial"/>
-          <w:color w:val="000000" w:themeColor="text1"/>
-        </w:rPr>
-        <w:t xml:space="preserve"> a consistent left-fist (T1) vs right-fist (T2) setting. T0 rest windows are excluded. The native 160 Hz rate is retained as motor imagery signals contain relevant content up to ~40 Hz and </w:t>
-      </w:r>
-      <w:r>
-        <w:rPr>
-          <w:rFonts w:ascii="Arial" w:eastAsia="Arial" w:hAnsi="Arial" w:cs="Arial"/>
-          <w:color w:val="000000" w:themeColor="text1"/>
-        </w:rPr>
-        <w:t xml:space="preserve">resampling can reduce the temporal precision and introduce artefacts </w:t>
-      </w:r>
-      <w:r>
-        <w:rPr>
-          <w:rFonts w:ascii="Arial" w:eastAsia="Arial" w:hAnsi="Arial" w:cs="Arial"/>
+          <w:rFonts w:ascii="Arial" w:hAnsi="Arial" w:cs="Arial"/>
+          <w:color w:val="000000" w:themeColor="text1"/>
+        </w:rPr>
+        <w:t>mHealth is included as a third HAR source. Right wrist IMU data is extracted from columns 15-20 (</w:t>
+      </w:r>
+      <w:proofErr w:type="spellStart"/>
+      <w:r>
+        <w:rPr>
+          <w:rFonts w:ascii="Arial" w:hAnsi="Arial" w:cs="Arial"/>
+          <w:color w:val="000000" w:themeColor="text1"/>
+        </w:rPr>
+        <w:t>acc_x</w:t>
+      </w:r>
+      <w:proofErr w:type="spellEnd"/>
+      <w:r>
+        <w:rPr>
+          <w:rFonts w:ascii="Arial" w:hAnsi="Arial" w:cs="Arial"/>
+          <w:color w:val="000000" w:themeColor="text1"/>
+        </w:rPr>
+        <w:t xml:space="preserve">, </w:t>
+      </w:r>
+      <w:proofErr w:type="spellStart"/>
+      <w:r>
+        <w:rPr>
+          <w:rFonts w:ascii="Arial" w:hAnsi="Arial" w:cs="Arial"/>
+          <w:color w:val="000000" w:themeColor="text1"/>
+        </w:rPr>
+        <w:t>acc_y</w:t>
+      </w:r>
+      <w:proofErr w:type="spellEnd"/>
+      <w:r>
+        <w:rPr>
+          <w:rFonts w:ascii="Arial" w:hAnsi="Arial" w:cs="Arial"/>
+          <w:color w:val="000000" w:themeColor="text1"/>
+        </w:rPr>
+        <w:t xml:space="preserve">, </w:t>
+      </w:r>
+      <w:proofErr w:type="spellStart"/>
+      <w:r>
+        <w:rPr>
+          <w:rFonts w:ascii="Arial" w:hAnsi="Arial" w:cs="Arial"/>
+          <w:color w:val="000000" w:themeColor="text1"/>
+        </w:rPr>
+        <w:t>acc_z</w:t>
+      </w:r>
+      <w:proofErr w:type="spellEnd"/>
+      <w:r>
+        <w:rPr>
+          <w:rFonts w:ascii="Arial" w:hAnsi="Arial" w:cs="Arial"/>
+          <w:color w:val="000000" w:themeColor="text1"/>
+        </w:rPr>
+        <w:t xml:space="preserve">, </w:t>
+      </w:r>
+      <w:proofErr w:type="spellStart"/>
+      <w:r>
+        <w:rPr>
+          <w:rFonts w:ascii="Arial" w:hAnsi="Arial" w:cs="Arial"/>
+          <w:color w:val="000000" w:themeColor="text1"/>
+        </w:rPr>
+        <w:t>gyr_x</w:t>
+      </w:r>
+      <w:proofErr w:type="spellEnd"/>
+      <w:r>
+        <w:rPr>
+          <w:rFonts w:ascii="Arial" w:hAnsi="Arial" w:cs="Arial"/>
+          <w:color w:val="000000" w:themeColor="text1"/>
+        </w:rPr>
+        <w:t xml:space="preserve">, </w:t>
+      </w:r>
+      <w:proofErr w:type="spellStart"/>
+      <w:r>
+        <w:rPr>
+          <w:rFonts w:ascii="Arial" w:hAnsi="Arial" w:cs="Arial"/>
+          <w:color w:val="000000" w:themeColor="text1"/>
+        </w:rPr>
+        <w:t>gyr_y</w:t>
+      </w:r>
+      <w:proofErr w:type="spellEnd"/>
+      <w:r>
+        <w:rPr>
+          <w:rFonts w:ascii="Arial" w:hAnsi="Arial" w:cs="Arial"/>
+          <w:color w:val="000000" w:themeColor="text1"/>
+        </w:rPr>
+        <w:t xml:space="preserve">, </w:t>
+      </w:r>
+      <w:proofErr w:type="spellStart"/>
+      <w:r>
+        <w:rPr>
+          <w:rFonts w:ascii="Arial" w:hAnsi="Arial" w:cs="Arial"/>
+          <w:color w:val="000000" w:themeColor="text1"/>
+        </w:rPr>
+        <w:t>gyr_z</w:t>
+      </w:r>
+      <w:proofErr w:type="spellEnd"/>
+      <w:r>
+        <w:rPr>
+          <w:rFonts w:ascii="Arial" w:hAnsi="Arial" w:cs="Arial"/>
+          <w:color w:val="000000" w:themeColor="text1"/>
+        </w:rPr>
+        <w:t xml:space="preserve">), matching the same 6-channel schema as PAMAP2 and WISDM. The native 50 Hz sampling rate is resampled to 20 Hz using </w:t>
+      </w:r>
+      <w:proofErr w:type="spellStart"/>
+      <w:r>
+        <w:rPr>
+          <w:rFonts w:ascii="Arial" w:hAnsi="Arial" w:cs="Arial"/>
+          <w:color w:val="000000" w:themeColor="text1"/>
+        </w:rPr>
+        <w:t>resample_</w:t>
+      </w:r>
+      <w:proofErr w:type="gramStart"/>
+      <w:r>
+        <w:rPr>
+          <w:rFonts w:ascii="Arial" w:hAnsi="Arial" w:cs="Arial"/>
+          <w:color w:val="000000" w:themeColor="text1"/>
+        </w:rPr>
+        <w:t>poly</w:t>
+      </w:r>
+      <w:proofErr w:type="spellEnd"/>
+      <w:r>
+        <w:rPr>
+          <w:rFonts w:ascii="Arial" w:hAnsi="Arial" w:cs="Arial"/>
           <w:color w:val="000000" w:themeColor="text1"/>
         </w:rPr>
         <w:t>(</w:t>
       </w:r>
-      <w:proofErr w:type="spellStart"/>
-      <w:r>
-        <w:rPr>
-          <w:rFonts w:ascii="Arial" w:eastAsia="Arial" w:hAnsi="Arial" w:cs="Arial"/>
-          <w:color w:val="000000" w:themeColor="text1"/>
-        </w:rPr>
-        <w:t>Mne.tools</w:t>
-      </w:r>
-      <w:proofErr w:type="spellEnd"/>
-      <w:r>
-        <w:rPr>
-          <w:rFonts w:ascii="Arial" w:eastAsia="Arial" w:hAnsi="Arial" w:cs="Arial"/>
-          <w:color w:val="000000" w:themeColor="text1"/>
-        </w:rPr>
-        <w:t>, 2025)</w:t>
-      </w:r>
-      <w:r>
-        <w:rPr>
-          <w:rFonts w:ascii="Arial" w:eastAsia="Arial" w:hAnsi="Arial" w:cs="Arial"/>
-          <w:color w:val="000000" w:themeColor="text1"/>
-        </w:rPr>
-        <w:t>. Fixed 4-second windows are extracted starting at each T1 or T2 onset, giving shape [N, 64, 640]. A 1</w:t>
-      </w:r>
-      <w:r>
-        <w:rPr>
-          <w:rFonts w:ascii="Arial" w:eastAsia="Arial" w:hAnsi="Arial" w:cs="Arial"/>
-          <w:color w:val="000000" w:themeColor="text1"/>
-        </w:rPr>
-        <w:t>-</w:t>
-      </w:r>
-      <w:r>
-        <w:rPr>
-          <w:rFonts w:ascii="Arial" w:eastAsia="Arial" w:hAnsi="Arial" w:cs="Arial"/>
-          <w:color w:val="000000" w:themeColor="text1"/>
-        </w:rPr>
-        <w:t>40 Hz band</w:t>
-      </w:r>
-      <w:r>
-        <w:rPr>
-          <w:rFonts w:ascii="Arial" w:eastAsia="Arial" w:hAnsi="Arial" w:cs="Arial"/>
-          <w:color w:val="000000" w:themeColor="text1"/>
-        </w:rPr>
-        <w:t xml:space="preserve"> </w:t>
-      </w:r>
-      <w:r>
-        <w:rPr>
-          <w:rFonts w:ascii="Arial" w:eastAsia="Arial" w:hAnsi="Arial" w:cs="Arial"/>
-          <w:color w:val="000000" w:themeColor="text1"/>
-        </w:rPr>
-        <w:t>pass filter removes slow drift and high-frequency noise</w:t>
-      </w:r>
-      <w:r>
-        <w:rPr>
-          <w:rFonts w:ascii="Arial" w:eastAsia="Arial" w:hAnsi="Arial" w:cs="Arial"/>
-          <w:color w:val="000000" w:themeColor="text1"/>
-        </w:rPr>
-        <w:t xml:space="preserve"> </w:t>
-      </w:r>
-      <w:r>
-        <w:rPr>
-          <w:rFonts w:ascii="Arial" w:eastAsia="Arial" w:hAnsi="Arial" w:cs="Arial"/>
-          <w:color w:val="000000" w:themeColor="text1"/>
-        </w:rPr>
-        <w:t>(Lyu, 2026)</w:t>
-      </w:r>
-      <w:r>
-        <w:rPr>
-          <w:rFonts w:ascii="Arial" w:eastAsia="Arial" w:hAnsi="Arial" w:cs="Arial"/>
-          <w:color w:val="000000" w:themeColor="text1"/>
-        </w:rPr>
-        <w:t xml:space="preserve">, a 60 Hz notch filter </w:t>
-      </w:r>
-      <w:r>
-        <w:rPr>
-          <w:rFonts w:ascii="Arial" w:eastAsia="Arial" w:hAnsi="Arial" w:cs="Arial"/>
-          <w:color w:val="000000" w:themeColor="text1"/>
-        </w:rPr>
-        <w:t xml:space="preserve">for </w:t>
-      </w:r>
-      <w:r>
-        <w:rPr>
-          <w:rFonts w:ascii="Arial" w:eastAsia="Arial" w:hAnsi="Arial" w:cs="Arial"/>
-          <w:color w:val="000000" w:themeColor="text1"/>
-        </w:rPr>
-        <w:t>power line interference, and common average referencing is applied across all 64 channels</w:t>
-      </w:r>
-      <w:r>
-        <w:rPr>
-          <w:rFonts w:ascii="Arial" w:eastAsia="Arial" w:hAnsi="Arial" w:cs="Arial"/>
-          <w:color w:val="000000" w:themeColor="text1"/>
-        </w:rPr>
-        <w:t xml:space="preserve"> to have a comprehensive dataset of brain activity</w:t>
-      </w:r>
-      <w:r>
-        <w:rPr>
-          <w:rFonts w:ascii="Arial" w:eastAsia="Arial" w:hAnsi="Arial" w:cs="Arial"/>
-          <w:color w:val="000000" w:themeColor="text1"/>
-        </w:rPr>
-        <w:t xml:space="preserve"> </w:t>
-      </w:r>
-      <w:r>
-        <w:rPr>
-          <w:rFonts w:ascii="Arial" w:eastAsia="Arial" w:hAnsi="Arial" w:cs="Arial"/>
-          <w:color w:val="000000" w:themeColor="text1"/>
-        </w:rPr>
-        <w:t>(Ludwig et al., 2009)</w:t>
-      </w:r>
-      <w:r>
-        <w:rPr>
-          <w:rFonts w:ascii="Arial" w:eastAsia="Arial" w:hAnsi="Arial" w:cs="Arial"/>
-          <w:color w:val="000000" w:themeColor="text1"/>
-        </w:rPr>
-        <w:t>. Subject ID, run ID, event code, and onset timing are preserved in metadata.</w:t>
+      <w:proofErr w:type="gramEnd"/>
+      <w:r>
+        <w:rPr>
+          <w:rFonts w:ascii="Arial" w:hAnsi="Arial" w:cs="Arial"/>
+          <w:color w:val="000000" w:themeColor="text1"/>
+        </w:rPr>
+        <w:t xml:space="preserve">2, 5). Label 0 (null class) is dropped </w:t>
+      </w:r>
+      <w:r>
+        <w:rPr>
+          <w:rFonts w:ascii="Arial" w:hAnsi="Arial" w:cs="Arial"/>
+          <w:color w:val="000000" w:themeColor="text1"/>
+        </w:rPr>
+        <w:t xml:space="preserve">as </w:t>
+      </w:r>
+      <w:r>
+        <w:rPr>
+          <w:rFonts w:ascii="Arial" w:hAnsi="Arial" w:cs="Arial"/>
+          <w:color w:val="000000" w:themeColor="text1"/>
+        </w:rPr>
+        <w:t xml:space="preserve">dataset documentation defines </w:t>
+      </w:r>
+      <w:r>
+        <w:rPr>
+          <w:rFonts w:ascii="Arial" w:hAnsi="Arial" w:cs="Arial"/>
+          <w:color w:val="000000" w:themeColor="text1"/>
+        </w:rPr>
+        <w:t xml:space="preserve">it </w:t>
+      </w:r>
+      <w:r>
+        <w:rPr>
+          <w:rFonts w:ascii="Arial" w:hAnsi="Arial" w:cs="Arial"/>
+          <w:color w:val="000000" w:themeColor="text1"/>
+        </w:rPr>
+        <w:t>as the null class</w:t>
+      </w:r>
+      <w:r>
+        <w:rPr>
+          <w:rFonts w:ascii="Arial" w:hAnsi="Arial" w:cs="Arial"/>
+          <w:color w:val="000000" w:themeColor="text1"/>
+        </w:rPr>
+        <w:t>,</w:t>
+      </w:r>
+      <w:r>
+        <w:rPr>
+          <w:rFonts w:ascii="Arial" w:hAnsi="Arial" w:cs="Arial"/>
+          <w:color w:val="000000" w:themeColor="text1"/>
+        </w:rPr>
+        <w:t xml:space="preserve"> consistent with PAMAP2 class 0 handling. Six activities are mapped to the unified schema: standing (L1), sitting (L2), walking (L4), stairs (L5), cycling (L9) and jogging (L10). All other activities are excluded as they are not present in the shared schema. Per-subject z-score normalisation is applied. The same windowing strategy as PAMAP2 and WISDM is used</w:t>
       </w:r>
     </w:p>
     <w:p>
@@ -757,7 +755,7 @@
           <w:bCs/>
           <w:color w:val="000000" w:themeColor="text1"/>
         </w:rPr>
-        <w:t>4. ECG: PTB-XL</w:t>
+        <w:t>3. EEG: EEGMMIDB</w:t>
       </w:r>
     </w:p>
     <w:p>
@@ -765,81 +763,88 @@
         <w:spacing w:before="40" w:after="40"/>
         <w:jc w:val="both"/>
         <w:rPr>
-          <w:rFonts w:ascii="Arial" w:eastAsia="Arial" w:hAnsi="Arial" w:cs="Arial"/>
-          <w:color w:val="000000" w:themeColor="text1"/>
-        </w:rPr>
-      </w:pPr>
-      <w:r>
-        <w:rPr>
-          <w:rFonts w:ascii="Arial" w:eastAsia="Arial" w:hAnsi="Arial" w:cs="Arial"/>
-          <w:color w:val="000000" w:themeColor="text1"/>
-        </w:rPr>
-        <w:t xml:space="preserve">100 Hz is selected over 500 Hz </w:t>
-      </w:r>
-      <w:r>
-        <w:rPr>
-          <w:rFonts w:ascii="Arial" w:eastAsia="Arial" w:hAnsi="Arial" w:cs="Arial"/>
-          <w:color w:val="000000" w:themeColor="text1"/>
-        </w:rPr>
-        <w:t xml:space="preserve">as </w:t>
-      </w:r>
-      <w:r>
-        <w:rPr>
-          <w:rFonts w:ascii="Arial" w:eastAsia="Arial" w:hAnsi="Arial" w:cs="Arial"/>
-          <w:color w:val="000000" w:themeColor="text1"/>
-        </w:rPr>
-        <w:t>i</w:t>
-      </w:r>
-      <w:r>
-        <w:rPr>
-          <w:rFonts w:ascii="Arial" w:eastAsia="Arial" w:hAnsi="Arial" w:cs="Arial"/>
-          <w:color w:val="000000" w:themeColor="text1"/>
-        </w:rPr>
-        <w:t>t is</w:t>
-      </w:r>
-      <w:r>
-        <w:rPr>
-          <w:rFonts w:ascii="Arial" w:eastAsia="Arial" w:hAnsi="Arial" w:cs="Arial"/>
-          <w:color w:val="000000" w:themeColor="text1"/>
-        </w:rPr>
-        <w:t xml:space="preserve"> sufficient for all clinically relevant ECG features </w:t>
-      </w:r>
-      <w:r>
-        <w:rPr>
-          <w:rFonts w:ascii="Arial" w:eastAsia="Arial" w:hAnsi="Arial" w:cs="Arial"/>
-          <w:color w:val="000000" w:themeColor="text1"/>
-        </w:rPr>
-        <w:t>(Kwon et al., 2018)</w:t>
-      </w:r>
-      <w:r>
-        <w:rPr>
-          <w:rFonts w:ascii="Arial" w:eastAsia="Arial" w:hAnsi="Arial" w:cs="Arial"/>
-          <w:color w:val="000000" w:themeColor="text1"/>
-        </w:rPr>
-        <w:t xml:space="preserve">. </w:t>
-      </w:r>
-      <w:r>
-        <w:rPr>
-          <w:rFonts w:ascii="Arial" w:eastAsia="Arial" w:hAnsi="Arial" w:cs="Arial"/>
-          <w:color w:val="000000" w:themeColor="text1"/>
-        </w:rPr>
-        <w:t xml:space="preserve">Output shape is [N, 12, 1000] covering all 12 standard leads at 10 seconds. The dataset-provided </w:t>
-      </w:r>
-      <w:proofErr w:type="spellStart"/>
-      <w:r>
-        <w:rPr>
-          <w:rFonts w:ascii="Arial" w:eastAsia="Arial" w:hAnsi="Arial" w:cs="Arial"/>
-          <w:color w:val="000000" w:themeColor="text1"/>
-        </w:rPr>
-        <w:t>strat_fold</w:t>
-      </w:r>
-      <w:proofErr w:type="spellEnd"/>
-      <w:r>
-        <w:rPr>
-          <w:rFonts w:ascii="Arial" w:eastAsia="Arial" w:hAnsi="Arial" w:cs="Arial"/>
-          <w:color w:val="000000" w:themeColor="text1"/>
-        </w:rPr>
-        <w:t xml:space="preserve"> column is used directly: folds 1–8 as training, fold 9 as validation, fold 10 as test. Patient-level assignment is guaranteed by the dataset authors, preventing leakage. A 0.5 Hz high-pass filter removes baseline wander</w:t>
+          <w:rFonts w:ascii="Arial" w:hAnsi="Arial" w:cs="Arial"/>
+          <w:color w:val="000000" w:themeColor="text1"/>
+        </w:rPr>
+      </w:pPr>
+      <w:r>
+        <w:rPr>
+          <w:rFonts w:ascii="Arial" w:eastAsia="Arial" w:hAnsi="Arial" w:cs="Arial"/>
+          <w:color w:val="000000" w:themeColor="text1"/>
+        </w:rPr>
+        <w:t>Only runs 4, 8, and 12 are used</w:t>
+      </w:r>
+      <w:r>
+        <w:rPr>
+          <w:rFonts w:ascii="Arial" w:eastAsia="Arial" w:hAnsi="Arial" w:cs="Arial"/>
+          <w:color w:val="000000" w:themeColor="text1"/>
+        </w:rPr>
+        <w:t>. T</w:t>
+      </w:r>
+      <w:r>
+        <w:rPr>
+          <w:rFonts w:ascii="Arial" w:eastAsia="Arial" w:hAnsi="Arial" w:cs="Arial"/>
+          <w:color w:val="000000" w:themeColor="text1"/>
+        </w:rPr>
+        <w:t>he motor imagery runs provid</w:t>
+      </w:r>
+      <w:r>
+        <w:rPr>
+          <w:rFonts w:ascii="Arial" w:eastAsia="Arial" w:hAnsi="Arial" w:cs="Arial"/>
+          <w:color w:val="000000" w:themeColor="text1"/>
+        </w:rPr>
+        <w:t>e</w:t>
+      </w:r>
+      <w:r>
+        <w:rPr>
+          <w:rFonts w:ascii="Arial" w:eastAsia="Arial" w:hAnsi="Arial" w:cs="Arial"/>
+          <w:color w:val="000000" w:themeColor="text1"/>
+        </w:rPr>
+        <w:t xml:space="preserve"> a consistent left-fist (T1) vs right-fist (T2) setting. T0 rest windows are excluded. The native 160 Hz rate is retained as motor imagery signals contain relevant content up to ~40 Hz and </w:t>
+      </w:r>
+      <w:r>
+        <w:rPr>
+          <w:rFonts w:ascii="Arial" w:eastAsia="Arial" w:hAnsi="Arial" w:cs="Arial"/>
+          <w:color w:val="000000" w:themeColor="text1"/>
+        </w:rPr>
+        <w:t>resampling can reduce the temporal precision and introduce artefacts (</w:t>
+      </w:r>
+      <w:proofErr w:type="spellStart"/>
+      <w:r>
+        <w:rPr>
+          <w:rFonts w:ascii="Arial" w:eastAsia="Arial" w:hAnsi="Arial" w:cs="Arial"/>
+          <w:color w:val="000000" w:themeColor="text1"/>
+        </w:rPr>
+        <w:t>Mne.tools</w:t>
+      </w:r>
+      <w:proofErr w:type="spellEnd"/>
+      <w:r>
+        <w:rPr>
+          <w:rFonts w:ascii="Arial" w:eastAsia="Arial" w:hAnsi="Arial" w:cs="Arial"/>
+          <w:color w:val="000000" w:themeColor="text1"/>
+        </w:rPr>
+        <w:t>, 2025)</w:t>
+      </w:r>
+      <w:r>
+        <w:rPr>
+          <w:rFonts w:ascii="Arial" w:eastAsia="Arial" w:hAnsi="Arial" w:cs="Arial"/>
+          <w:color w:val="000000" w:themeColor="text1"/>
+        </w:rPr>
+        <w:t>. Fixed 4-second windows are extracted starting at each T1 or T2 onset, giving shape [N, 64, 640]. A 1</w:t>
+      </w:r>
+      <w:r>
+        <w:rPr>
+          <w:rFonts w:ascii="Arial" w:eastAsia="Arial" w:hAnsi="Arial" w:cs="Arial"/>
+          <w:color w:val="000000" w:themeColor="text1"/>
+        </w:rPr>
+        <w:t>-</w:t>
+      </w:r>
+      <w:r>
+        <w:rPr>
+          <w:rFonts w:ascii="Arial" w:eastAsia="Arial" w:hAnsi="Arial" w:cs="Arial"/>
+          <w:color w:val="000000" w:themeColor="text1"/>
+        </w:rPr>
+        <w:t>40 Hz band</w:t>
       </w:r>
       <w:r>
         <w:rPr>
@@ -853,86 +858,56 @@
           <w:rFonts w:ascii="Arial" w:eastAsia="Arial" w:hAnsi="Arial" w:cs="Arial"/>
           <w:color w:val="000000" w:themeColor="text1"/>
         </w:rPr>
-        <w:t>(Luo et al., 2013)</w:t>
-      </w:r>
-      <w:r>
-        <w:rPr>
-          <w:rFonts w:ascii="Arial" w:eastAsia="Arial" w:hAnsi="Arial" w:cs="Arial"/>
-          <w:color w:val="000000" w:themeColor="text1"/>
-        </w:rPr>
-        <w:t>, a 50 Hz notch filter removes European power line interference</w:t>
-      </w:r>
-      <w:r>
-        <w:rPr>
-          <w:rFonts w:ascii="Arial" w:eastAsia="Arial" w:hAnsi="Arial" w:cs="Arial"/>
-          <w:color w:val="000000" w:themeColor="text1"/>
-        </w:rPr>
-        <w:t xml:space="preserve"> </w:t>
-      </w:r>
-      <w:r>
-        <w:rPr>
-          <w:rFonts w:ascii="Arial" w:eastAsia="Arial" w:hAnsi="Arial" w:cs="Arial"/>
-          <w:color w:val="000000" w:themeColor="text1"/>
-        </w:rPr>
-        <w:t>(Zhou and Zhang, 2013)</w:t>
-      </w:r>
-      <w:r>
-        <w:rPr>
-          <w:rFonts w:ascii="Arial" w:eastAsia="Arial" w:hAnsi="Arial" w:cs="Arial"/>
-          <w:color w:val="000000" w:themeColor="text1"/>
-        </w:rPr>
-        <w:t xml:space="preserve"> and per-lead z-score normalisation is applied</w:t>
-      </w:r>
-      <w:r>
-        <w:rPr>
-          <w:rFonts w:ascii="Arial" w:eastAsia="Arial" w:hAnsi="Arial" w:cs="Arial"/>
-          <w:color w:val="000000" w:themeColor="text1"/>
-        </w:rPr>
-        <w:t xml:space="preserve"> </w:t>
-      </w:r>
-      <w:r>
-        <w:rPr>
-          <w:rFonts w:ascii="Arial" w:eastAsia="Arial" w:hAnsi="Arial" w:cs="Arial"/>
-          <w:color w:val="000000" w:themeColor="text1"/>
-        </w:rPr>
-        <w:t>(Al-</w:t>
-      </w:r>
-      <w:proofErr w:type="spellStart"/>
-      <w:r>
-        <w:rPr>
-          <w:rFonts w:ascii="Arial" w:eastAsia="Arial" w:hAnsi="Arial" w:cs="Arial"/>
-          <w:color w:val="000000" w:themeColor="text1"/>
-        </w:rPr>
-        <w:t>Zaiti</w:t>
-      </w:r>
-      <w:proofErr w:type="spellEnd"/>
-      <w:r>
-        <w:rPr>
-          <w:rFonts w:ascii="Arial" w:eastAsia="Arial" w:hAnsi="Arial" w:cs="Arial"/>
-          <w:color w:val="000000" w:themeColor="text1"/>
-        </w:rPr>
-        <w:t xml:space="preserve"> et al., 2023)</w:t>
-      </w:r>
-      <w:r>
-        <w:rPr>
-          <w:rFonts w:ascii="Arial" w:eastAsia="Arial" w:hAnsi="Arial" w:cs="Arial"/>
-          <w:color w:val="000000" w:themeColor="text1"/>
-        </w:rPr>
-        <w:t>. Patient ID, record ID, SCP codes, lead names</w:t>
-      </w:r>
-      <w:r>
-        <w:rPr>
-          <w:rFonts w:ascii="Arial" w:eastAsia="Arial" w:hAnsi="Arial" w:cs="Arial"/>
-          <w:color w:val="000000" w:themeColor="text1"/>
-        </w:rPr>
-        <w:t xml:space="preserve"> </w:t>
-      </w:r>
-      <w:r>
-        <w:rPr>
-          <w:rFonts w:ascii="Arial" w:eastAsia="Arial" w:hAnsi="Arial" w:cs="Arial"/>
-          <w:color w:val="000000" w:themeColor="text1"/>
-        </w:rPr>
-        <w:t>and fold are preserved in metadata.</w:t>
+        <w:t>pass filter removes slow drift and high-frequency noise</w:t>
+      </w:r>
+      <w:r>
+        <w:rPr>
+          <w:rFonts w:ascii="Arial" w:eastAsia="Arial" w:hAnsi="Arial" w:cs="Arial"/>
+          <w:color w:val="000000" w:themeColor="text1"/>
+        </w:rPr>
+        <w:t xml:space="preserve"> (Lyu, 2026)</w:t>
+      </w:r>
+      <w:r>
+        <w:rPr>
+          <w:rFonts w:ascii="Arial" w:eastAsia="Arial" w:hAnsi="Arial" w:cs="Arial"/>
+          <w:color w:val="000000" w:themeColor="text1"/>
+        </w:rPr>
+        <w:t xml:space="preserve">, a 60 Hz notch filter </w:t>
+      </w:r>
+      <w:r>
+        <w:rPr>
+          <w:rFonts w:ascii="Arial" w:eastAsia="Arial" w:hAnsi="Arial" w:cs="Arial"/>
+          <w:color w:val="000000" w:themeColor="text1"/>
+        </w:rPr>
+        <w:t xml:space="preserve">for </w:t>
+      </w:r>
+      <w:r>
+        <w:rPr>
+          <w:rFonts w:ascii="Arial" w:eastAsia="Arial" w:hAnsi="Arial" w:cs="Arial"/>
+          <w:color w:val="000000" w:themeColor="text1"/>
+        </w:rPr>
+        <w:t>power line interference, and common average referencing is applied across all 64 channels</w:t>
+      </w:r>
+      <w:r>
+        <w:rPr>
+          <w:rFonts w:ascii="Arial" w:eastAsia="Arial" w:hAnsi="Arial" w:cs="Arial"/>
+          <w:color w:val="000000" w:themeColor="text1"/>
+        </w:rPr>
+        <w:t xml:space="preserve"> to have a comprehensive dataset of brain activity</w:t>
+      </w:r>
+      <w:r>
+        <w:rPr>
+          <w:rFonts w:ascii="Arial" w:eastAsia="Arial" w:hAnsi="Arial" w:cs="Arial"/>
+          <w:color w:val="000000" w:themeColor="text1"/>
+        </w:rPr>
+        <w:t xml:space="preserve"> (Ludwig et al., 2009)</w:t>
+      </w:r>
+      <w:r>
+        <w:rPr>
+          <w:rFonts w:ascii="Arial" w:eastAsia="Arial" w:hAnsi="Arial" w:cs="Arial"/>
+          <w:color w:val="000000" w:themeColor="text1"/>
+        </w:rPr>
+        <w:t>. Subject ID, run ID, event code, and onset timing are preserved in metadata.</w:t>
       </w:r>
     </w:p>
     <w:p>
@@ -951,6 +926,172 @@
           <w:bCs/>
           <w:color w:val="000000" w:themeColor="text1"/>
         </w:rPr>
+        <w:t>4. ECG: PTB-XL</w:t>
+      </w:r>
+    </w:p>
+    <w:p>
+      <w:pPr>
+        <w:spacing w:before="40" w:after="40"/>
+        <w:jc w:val="both"/>
+        <w:rPr>
+          <w:rFonts w:ascii="Arial" w:eastAsia="Arial" w:hAnsi="Arial" w:cs="Arial"/>
+          <w:color w:val="000000" w:themeColor="text1"/>
+        </w:rPr>
+      </w:pPr>
+      <w:r>
+        <w:rPr>
+          <w:rFonts w:ascii="Arial" w:eastAsia="Arial" w:hAnsi="Arial" w:cs="Arial"/>
+          <w:color w:val="000000" w:themeColor="text1"/>
+        </w:rPr>
+        <w:t xml:space="preserve">100 Hz is selected over 500 Hz </w:t>
+      </w:r>
+      <w:r>
+        <w:rPr>
+          <w:rFonts w:ascii="Arial" w:eastAsia="Arial" w:hAnsi="Arial" w:cs="Arial"/>
+          <w:color w:val="000000" w:themeColor="text1"/>
+        </w:rPr>
+        <w:t xml:space="preserve">as </w:t>
+      </w:r>
+      <w:r>
+        <w:rPr>
+          <w:rFonts w:ascii="Arial" w:eastAsia="Arial" w:hAnsi="Arial" w:cs="Arial"/>
+          <w:color w:val="000000" w:themeColor="text1"/>
+        </w:rPr>
+        <w:t>i</w:t>
+      </w:r>
+      <w:r>
+        <w:rPr>
+          <w:rFonts w:ascii="Arial" w:eastAsia="Arial" w:hAnsi="Arial" w:cs="Arial"/>
+          <w:color w:val="000000" w:themeColor="text1"/>
+        </w:rPr>
+        <w:t>t is</w:t>
+      </w:r>
+      <w:r>
+        <w:rPr>
+          <w:rFonts w:ascii="Arial" w:eastAsia="Arial" w:hAnsi="Arial" w:cs="Arial"/>
+          <w:color w:val="000000" w:themeColor="text1"/>
+        </w:rPr>
+        <w:t xml:space="preserve"> sufficient for all clinically relevant ECG features </w:t>
+      </w:r>
+      <w:r>
+        <w:rPr>
+          <w:rFonts w:ascii="Arial" w:eastAsia="Arial" w:hAnsi="Arial" w:cs="Arial"/>
+          <w:color w:val="000000" w:themeColor="text1"/>
+        </w:rPr>
+        <w:t xml:space="preserve">(Kwon et al., 2018). </w:t>
+      </w:r>
+      <w:r>
+        <w:rPr>
+          <w:rFonts w:ascii="Arial" w:eastAsia="Arial" w:hAnsi="Arial" w:cs="Arial"/>
+          <w:color w:val="000000" w:themeColor="text1"/>
+        </w:rPr>
+        <w:t xml:space="preserve">Output shape is [N, 12, 1000] covering all 12 standard leads at 10 seconds. The dataset-provided </w:t>
+      </w:r>
+      <w:proofErr w:type="spellStart"/>
+      <w:r>
+        <w:rPr>
+          <w:rFonts w:ascii="Arial" w:eastAsia="Arial" w:hAnsi="Arial" w:cs="Arial"/>
+          <w:color w:val="000000" w:themeColor="text1"/>
+        </w:rPr>
+        <w:t>strat_fold</w:t>
+      </w:r>
+      <w:proofErr w:type="spellEnd"/>
+      <w:r>
+        <w:rPr>
+          <w:rFonts w:ascii="Arial" w:eastAsia="Arial" w:hAnsi="Arial" w:cs="Arial"/>
+          <w:color w:val="000000" w:themeColor="text1"/>
+        </w:rPr>
+        <w:t xml:space="preserve"> column is used directly: folds 1–8 as training, fold 9 as validation, fold 10 as test. Patient-level assignment is guaranteed by the dataset authors, preventing leakage. A 0.5 Hz high-pass filter removes baseline wander</w:t>
+      </w:r>
+      <w:r>
+        <w:rPr>
+          <w:rFonts w:ascii="Arial" w:eastAsia="Arial" w:hAnsi="Arial" w:cs="Arial"/>
+          <w:color w:val="000000" w:themeColor="text1"/>
+        </w:rPr>
+        <w:t xml:space="preserve"> (Luo et al., 2013)</w:t>
+      </w:r>
+      <w:r>
+        <w:rPr>
+          <w:rFonts w:ascii="Arial" w:eastAsia="Arial" w:hAnsi="Arial" w:cs="Arial"/>
+          <w:color w:val="000000" w:themeColor="text1"/>
+        </w:rPr>
+        <w:t>, a 50 Hz notch filter removes European power line interference</w:t>
+      </w:r>
+      <w:r>
+        <w:rPr>
+          <w:rFonts w:ascii="Arial" w:eastAsia="Arial" w:hAnsi="Arial" w:cs="Arial"/>
+          <w:color w:val="000000" w:themeColor="text1"/>
+        </w:rPr>
+        <w:t xml:space="preserve"> (Zhou and Zhang, 2013)</w:t>
+      </w:r>
+      <w:r>
+        <w:rPr>
+          <w:rFonts w:ascii="Arial" w:eastAsia="Arial" w:hAnsi="Arial" w:cs="Arial"/>
+          <w:color w:val="000000" w:themeColor="text1"/>
+        </w:rPr>
+        <w:t xml:space="preserve"> and per-lead z-score normalisation is applied</w:t>
+      </w:r>
+      <w:r>
+        <w:rPr>
+          <w:rFonts w:ascii="Arial" w:eastAsia="Arial" w:hAnsi="Arial" w:cs="Arial"/>
+          <w:color w:val="000000" w:themeColor="text1"/>
+        </w:rPr>
+        <w:t xml:space="preserve"> (Al-</w:t>
+      </w:r>
+      <w:proofErr w:type="spellStart"/>
+      <w:r>
+        <w:rPr>
+          <w:rFonts w:ascii="Arial" w:eastAsia="Arial" w:hAnsi="Arial" w:cs="Arial"/>
+          <w:color w:val="000000" w:themeColor="text1"/>
+        </w:rPr>
+        <w:t>Zaiti</w:t>
+      </w:r>
+      <w:proofErr w:type="spellEnd"/>
+      <w:r>
+        <w:rPr>
+          <w:rFonts w:ascii="Arial" w:eastAsia="Arial" w:hAnsi="Arial" w:cs="Arial"/>
+          <w:color w:val="000000" w:themeColor="text1"/>
+        </w:rPr>
+        <w:t xml:space="preserve"> et al., 2023)</w:t>
+      </w:r>
+      <w:r>
+        <w:rPr>
+          <w:rFonts w:ascii="Arial" w:eastAsia="Arial" w:hAnsi="Arial" w:cs="Arial"/>
+          <w:color w:val="000000" w:themeColor="text1"/>
+        </w:rPr>
+        <w:t>. Patient ID, record ID, SCP codes, lead names</w:t>
+      </w:r>
+      <w:r>
+        <w:rPr>
+          <w:rFonts w:ascii="Arial" w:eastAsia="Arial" w:hAnsi="Arial" w:cs="Arial"/>
+          <w:color w:val="000000" w:themeColor="text1"/>
+        </w:rPr>
+        <w:t xml:space="preserve"> </w:t>
+      </w:r>
+      <w:r>
+        <w:rPr>
+          <w:rFonts w:ascii="Arial" w:eastAsia="Arial" w:hAnsi="Arial" w:cs="Arial"/>
+          <w:color w:val="000000" w:themeColor="text1"/>
+        </w:rPr>
+        <w:t>and fold are preserved in metadata.</w:t>
+      </w:r>
+    </w:p>
+    <w:p>
+      <w:pPr>
+        <w:spacing w:before="160" w:after="80"/>
+        <w:jc w:val="both"/>
+        <w:rPr>
+          <w:rFonts w:ascii="Arial" w:hAnsi="Arial" w:cs="Arial"/>
+          <w:color w:val="000000" w:themeColor="text1"/>
+        </w:rPr>
+      </w:pPr>
+      <w:r>
+        <w:rPr>
+          <w:rFonts w:ascii="Arial" w:eastAsia="Arial" w:hAnsi="Arial" w:cs="Arial"/>
+          <w:b/>
+          <w:bCs/>
+          <w:color w:val="000000" w:themeColor="text1"/>
+        </w:rPr>
         <w:t>5. Storage, RAM, and Engineering Risks</w:t>
       </w:r>
     </w:p>
@@ -959,60 +1100,48 @@
         <w:spacing w:before="40" w:after="40"/>
         <w:jc w:val="both"/>
         <w:rPr>
-          <w:rFonts w:ascii="Arial" w:hAnsi="Arial" w:cs="Arial"/>
-          <w:color w:val="000000" w:themeColor="text1"/>
-        </w:rPr>
-      </w:pPr>
-      <w:r>
-        <w:rPr>
-          <w:rFonts w:ascii="Arial" w:eastAsia="Arial" w:hAnsi="Arial" w:cs="Arial"/>
-          <w:color w:val="000000" w:themeColor="text1"/>
-        </w:rPr>
-        <w:t xml:space="preserve">Peak RAM: ~4 GB during EEG processing, handled by </w:t>
-      </w:r>
-      <w:proofErr w:type="gramStart"/>
-      <w:r>
-        <w:rPr>
-          <w:rFonts w:ascii="Arial" w:eastAsia="Arial" w:hAnsi="Arial" w:cs="Arial"/>
-          <w:color w:val="000000" w:themeColor="text1"/>
-        </w:rPr>
-        <w:t>subject</w:t>
-      </w:r>
-      <w:r>
-        <w:rPr>
-          <w:rFonts w:ascii="Arial" w:eastAsia="Arial" w:hAnsi="Arial" w:cs="Arial"/>
-          <w:color w:val="000000" w:themeColor="text1"/>
-        </w:rPr>
-        <w:t xml:space="preserve"> </w:t>
-      </w:r>
-      <w:r>
-        <w:rPr>
-          <w:rFonts w:ascii="Arial" w:eastAsia="Arial" w:hAnsi="Arial" w:cs="Arial"/>
-          <w:color w:val="000000" w:themeColor="text1"/>
-        </w:rPr>
-        <w:t>by</w:t>
-      </w:r>
-      <w:r>
-        <w:rPr>
-          <w:rFonts w:ascii="Arial" w:eastAsia="Arial" w:hAnsi="Arial" w:cs="Arial"/>
-          <w:color w:val="000000" w:themeColor="text1"/>
-        </w:rPr>
-        <w:t xml:space="preserve"> </w:t>
-      </w:r>
-      <w:r>
-        <w:rPr>
-          <w:rFonts w:ascii="Arial" w:eastAsia="Arial" w:hAnsi="Arial" w:cs="Arial"/>
-          <w:color w:val="000000" w:themeColor="text1"/>
-        </w:rPr>
-        <w:t>subject</w:t>
-      </w:r>
-      <w:proofErr w:type="gramEnd"/>
-      <w:r>
-        <w:rPr>
-          <w:rFonts w:ascii="Arial" w:eastAsia="Arial" w:hAnsi="Arial" w:cs="Arial"/>
-          <w:color w:val="000000" w:themeColor="text1"/>
-        </w:rPr>
-        <w:t xml:space="preserve"> chunking. PAMAP2 preprocessing is also performed per-subject to avoid loading all 9 subjects into memory simultaneously. Estimated runtime: ~50 minutes excluding downloads. Key engineering risks:</w:t>
+          <w:rFonts w:ascii="Arial" w:eastAsia="Arial" w:hAnsi="Arial" w:cs="Arial"/>
+          <w:color w:val="000000" w:themeColor="text1"/>
+        </w:rPr>
+      </w:pPr>
+      <w:r>
+        <w:rPr>
+          <w:rFonts w:ascii="Arial" w:eastAsia="Arial" w:hAnsi="Arial" w:cs="Arial"/>
+          <w:color w:val="000000" w:themeColor="text1"/>
+        </w:rPr>
+        <w:t>Raw storage: ~8.5 GB total (PAMAP2: 2.9 GB, WISDM: 1.5 GB, EEGMMIDB: 3.4 GB, PTB-XL: 616 MB, mHealth: 72 MB). Processed storage: ~1.9 GB. Peak RAM: ~4 GB during EEG processing, handled by subject-by-subject chunking. PAMAP2 and mHealth preprocessing are also performed per-subjec</w:t>
+      </w:r>
+      <w:r>
+        <w:rPr>
+          <w:rFonts w:ascii="Arial" w:eastAsia="Arial" w:hAnsi="Arial" w:cs="Arial"/>
+          <w:color w:val="000000" w:themeColor="text1"/>
+        </w:rPr>
+        <w:t>t</w:t>
+      </w:r>
+      <w:r>
+        <w:rPr>
+          <w:rFonts w:ascii="Arial" w:eastAsia="Arial" w:hAnsi="Arial" w:cs="Arial"/>
+          <w:color w:val="000000" w:themeColor="text1"/>
+        </w:rPr>
+        <w:t>. Estimated runtime: ~50 minutes excluding downloads.</w:t>
+      </w:r>
+    </w:p>
+    <w:p>
+      <w:pPr>
+        <w:spacing w:before="40" w:after="40"/>
+        <w:jc w:val="both"/>
+        <w:rPr>
+          <w:rFonts w:ascii="Arial" w:hAnsi="Arial" w:cs="Arial"/>
+          <w:color w:val="000000" w:themeColor="text1"/>
+        </w:rPr>
+      </w:pPr>
+      <w:r>
+        <w:rPr>
+          <w:rFonts w:ascii="Arial" w:eastAsia="Arial" w:hAnsi="Arial" w:cs="Arial"/>
+          <w:color w:val="000000" w:themeColor="text1"/>
+        </w:rPr>
+        <w:lastRenderedPageBreak/>
+        <w:t>Key engineering risks:</w:t>
       </w:r>
     </w:p>
     <w:p>
@@ -1072,7 +1201,7 @@
           <w:rFonts w:ascii="Arial" w:eastAsia="Arial" w:hAnsi="Arial" w:cs="Arial"/>
           <w:color w:val="000000" w:themeColor="text1"/>
         </w:rPr>
-        <w:t>WISDM accel/gyro merge: files are aligned by index after sorting by timestamp; negligible jitter at 20 Hz.</w:t>
+        <w:t>EEG annotation parsing: only onset timestamps used, not event duration, to guarantee consistent 4-second windows across all 109 subjects.</w:t>
       </w:r>
     </w:p>
     <w:p>
@@ -1094,7 +1223,21 @@
           <w:rFonts w:ascii="Arial" w:eastAsia="Arial" w:hAnsi="Arial" w:cs="Arial"/>
           <w:color w:val="000000" w:themeColor="text1"/>
         </w:rPr>
-        <w:t>EEG annotation parsing: only onset timestamps used, not event duration, to guarantee consistent 4-second windows across all 109 subjects.</w:t>
+        <w:t>PTB-XL multi-label records: the SCP diagnostic superclass with the highest annotator likelihood is used as the primary label</w:t>
+      </w:r>
+      <w:r>
+        <w:rPr>
+          <w:rFonts w:ascii="Arial" w:eastAsia="Arial" w:hAnsi="Arial" w:cs="Arial"/>
+          <w:color w:val="000000" w:themeColor="text1"/>
+        </w:rPr>
+        <w:t>. A</w:t>
+      </w:r>
+      <w:r>
+        <w:rPr>
+          <w:rFonts w:ascii="Arial" w:eastAsia="Arial" w:hAnsi="Arial" w:cs="Arial"/>
+          <w:color w:val="000000" w:themeColor="text1"/>
+        </w:rPr>
+        <w:t>ll codes are preserved in metadata for downstream use.</w:t>
       </w:r>
     </w:p>
     <w:p>
@@ -1113,33 +1256,30 @@
       </w:pPr>
       <w:r>
         <w:rPr>
-          <w:rFonts w:ascii="Arial" w:eastAsia="Arial" w:hAnsi="Arial" w:cs="Arial"/>
-          <w:color w:val="000000" w:themeColor="text1"/>
-        </w:rPr>
-        <w:t>PTB-XL multi-label records: the SCP diagnostic superclass with the highest annotator likelihood is used as the primary label</w:t>
-      </w:r>
-      <w:r>
-        <w:rPr>
-          <w:rFonts w:ascii="Arial" w:eastAsia="Arial" w:hAnsi="Arial" w:cs="Arial"/>
-          <w:color w:val="000000" w:themeColor="text1"/>
-        </w:rPr>
-        <w:t>. A</w:t>
-      </w:r>
-      <w:r>
-        <w:rPr>
-          <w:rFonts w:ascii="Arial" w:eastAsia="Arial" w:hAnsi="Arial" w:cs="Arial"/>
-          <w:color w:val="000000" w:themeColor="text1"/>
-        </w:rPr>
-        <w:t>ll codes are preserved in metadata for downstream use.</w:t>
-      </w:r>
-    </w:p>
-    <w:p>
-      <w:pPr>
-        <w:pStyle w:val="ListParagraph"/>
-        <w:numPr>
-          <w:ilvl w:val="0"/>
-          <w:numId w:val="2"/>
-        </w:numPr>
+          <w:rFonts w:ascii="Arial" w:hAnsi="Arial" w:cs="Arial"/>
+          <w:color w:val="000000" w:themeColor="text1"/>
+        </w:rPr>
+        <w:t>WISDM watch accelerometer and gyroscope files are merged by index alignment after sorting by timestamp. Only .txt raw files are used; .</w:t>
+      </w:r>
+      <w:proofErr w:type="spellStart"/>
+      <w:r>
+        <w:rPr>
+          <w:rFonts w:ascii="Arial" w:hAnsi="Arial" w:cs="Arial"/>
+          <w:color w:val="000000" w:themeColor="text1"/>
+        </w:rPr>
+        <w:t>arff</w:t>
+      </w:r>
+      <w:proofErr w:type="spellEnd"/>
+      <w:r>
+        <w:rPr>
+          <w:rFonts w:ascii="Arial" w:hAnsi="Arial" w:cs="Arial"/>
+          <w:color w:val="000000" w:themeColor="text1"/>
+        </w:rPr>
+        <w:t xml:space="preserve"> files are excluded.</w:t>
+      </w:r>
+    </w:p>
+    <w:p>
+      <w:pPr>
         <w:spacing w:before="30" w:after="30"/>
         <w:jc w:val="both"/>
         <w:rPr>
@@ -1147,30 +1287,6 @@
           <w:color w:val="000000" w:themeColor="text1"/>
         </w:rPr>
       </w:pPr>
-      <w:r>
-        <w:rPr>
-          <w:rFonts w:ascii="Arial" w:hAnsi="Arial" w:cs="Arial"/>
-          <w:color w:val="000000" w:themeColor="text1"/>
-        </w:rPr>
-        <w:lastRenderedPageBreak/>
-        <w:t>WISDM watch accelerometer and gyroscope files are merged by index alignment after sorting by timestamp. Only .txt raw files are used; .</w:t>
-      </w:r>
-      <w:proofErr w:type="spellStart"/>
-      <w:r>
-        <w:rPr>
-          <w:rFonts w:ascii="Arial" w:hAnsi="Arial" w:cs="Arial"/>
-          <w:color w:val="000000" w:themeColor="text1"/>
-        </w:rPr>
-        <w:t>arff</w:t>
-      </w:r>
-      <w:proofErr w:type="spellEnd"/>
-      <w:r>
-        <w:rPr>
-          <w:rFonts w:ascii="Arial" w:hAnsi="Arial" w:cs="Arial"/>
-          <w:color w:val="000000" w:themeColor="text1"/>
-        </w:rPr>
-        <w:t xml:space="preserve"> files are excluded.</w:t>
-      </w:r>
     </w:p>
     <w:p>
       <w:pPr>
@@ -1178,32 +1294,16 @@
         <w:jc w:val="both"/>
         <w:rPr>
           <w:rFonts w:ascii="Arial" w:hAnsi="Arial" w:cs="Arial"/>
-          <w:color w:val="000000" w:themeColor="text1"/>
-        </w:rPr>
-      </w:pPr>
-    </w:p>
-    <w:p>
-      <w:pPr>
-        <w:spacing w:before="30" w:after="30"/>
-        <w:jc w:val="both"/>
-        <w:rPr>
-          <w:rFonts w:ascii="Arial" w:hAnsi="Arial" w:cs="Arial"/>
-          <w:color w:val="000000" w:themeColor="text1"/>
-        </w:rPr>
-      </w:pPr>
-    </w:p>
-    <w:p>
-      <w:pPr>
-        <w:spacing w:before="30" w:after="30"/>
-        <w:jc w:val="both"/>
-        <w:rPr>
-          <w:rFonts w:ascii="Arial" w:hAnsi="Arial" w:cs="Arial"/>
-          <w:color w:val="000000" w:themeColor="text1"/>
-        </w:rPr>
-      </w:pPr>
-      <w:r>
-        <w:rPr>
-          <w:rFonts w:ascii="Arial" w:hAnsi="Arial" w:cs="Arial"/>
+          <w:b/>
+          <w:bCs/>
+          <w:color w:val="000000" w:themeColor="text1"/>
+        </w:rPr>
+      </w:pPr>
+      <w:r>
+        <w:rPr>
+          <w:rFonts w:ascii="Arial" w:hAnsi="Arial" w:cs="Arial"/>
+          <w:b/>
+          <w:bCs/>
           <w:color w:val="000000" w:themeColor="text1"/>
         </w:rPr>
         <w:t>References:</w:t>

</xml_diff>